<commit_message>
michctapp application: latex gated (latex_bias 0, newtx fitted a p9 word more at 0.05); docx still reported (Word's footnote area) (fb-595.54.63)
Co-Authored-By: Claude Opus 5.5 <noreply@anthropic.com>
</commit_message>
<xml_diff>
--- a/courts/sixth-circuit/michigan/state/court-of-appeals/petition-for-discretionary-review/usage/OUTPUT-petition-for-discretionary-review.docx
+++ b/courts/sixth-circuit/michigan/state/court-of-appeals/petition-for-discretionary-review/usage/OUTPUT-petition-for-discretionary-review.docx
@@ -3675,7 +3675,7 @@
         <w:tab/>
       </w:r>
       <w:r>
-        <w:t xml:space="preserve">11</w:t>
+        <w:t xml:space="preserve">12</w:t>
       </w:r>
     </w:p>
     <w:p>
@@ -5629,7 +5629,7 @@
         <w:pStyle w:val="BodyText"/>
       </w:pPr>
       <w:r>
-        <w:t xml:space="preserve">One of the undersigned counsel represented Mr. Kennedy on the new criminal charges that arose following Mr. Kennedy’s September 9 arrest. Upon learning that the Sheriff had unilaterally decided to incarcerate Mr. Kennedy until July 2022 for violation of the ZTP without judicial intervention, counsel filed an Emergency Motion to Modify Terms of Probation/​Prevent Violation of Due Process on December 21, 2021. The motion argued that the ZTP is a form of probation under Michigan law and thus, that Mr. Kennedy was entitled to a hearing before his sentencing judge, who would adjudicate whether he violated the terms of his probation and determine an appropriate sanction. On January 6, 2022, the sentencing court denied the motion, refusing to take jurisdiction of the matter and concluding that “placement into the ZTP and . . . adherence to the rules of the ZTP is entirely within the purview of the Oakland County Sheriff’s Office.” Ex. A, p 3. On January 19, 2022, Appellant filed a motion for reconsideration, requesting only that the matter be set for a probation violation hearing. Ex. B. The motion was denied on February 11, 2022. Ex. C. This appeal follows.</w:t>
+        <w:t xml:space="preserve">One of the undersigned counsel represented Mr. Kennedy on the new criminal charges that arose following Mr. Kennedy’s September 9 arrest. Upon learning that the Sheriff had unilaterally decided to incarcerate Mr. Kennedy until July 2022 for violation of the ZTP without judicial intervention, counsel filed an Emergency Motion to Modify Terms of Probation/​Prevent Violation of Due Process on December 21, 2021. The motion argued that the ZTP is a form of probation under Michigan law and thus, that Mr. Kennedy was entitled to a hearing before his sentencing judge, who would adjudicate whether he violated the terms of his probation and determine an appropriate sanction. On January 6, 2022, the sentencing court denied the motion, refusing to take jurisdiction of the matter and concluding that “placement into the ZTP and ⁠. ⁠. ⁠. adherence to the rules of the ZTP is entirely within the purview of the Oakland County Sheriff’s Office.” Ex. A, p 3. On January 19, 2022, Appellant filed a motion for reconsideration, requesting only that the matter be set for a probation violation hearing. Ex. B. The motion was denied on February 11, 2022. Ex. C. This appeal follows.</w:t>
       </w:r>
     </w:p>
     <w:p>
@@ -6871,7 +6871,7 @@
         <w:t xml:space="preserve"> </w:t>
       </w:r>
       <w:r>
-        <w:t xml:space="preserve">A community corrections program is defined by statute as any “program that is operated by or contracted for by a city, county, or group of counties . . . and that offers programs, services, or both, instead of incarceration in prison, and that are locally operated and provide a continuum of programming options from pretrial through post-adjudication.” MCL 791.402(c)</w:t>
+        <w:t xml:space="preserve">A community corrections program is defined by statute as any “program that is operated by or contracted for by a city, county, or group of counties ⁠. ⁠. ⁠. and that offers programs, services, or both, instead of incarceration in prison, and that are locally operated and provide a continuum of programming options from pretrial through post-adjudication.” MCL 791.402(c)</w:t>
       </w:r>
       <w:r>
         <w:t xml:space="preserve"> </w:t>
@@ -7035,7 +7035,7 @@
         <w:t xml:space="preserve"> </w:t>
       </w:r>
       <w:r>
-        <w:t xml:space="preserve">It cited the statutory definition of a community corrections program, which, again, is a “program that is operated by or contracted for by a city, county, or group of counties . . . and that offers programs, services, or both, instead of incarceration in prison, and that are locally operated and provide a continuum of programming options from pretrial through post-adjudication.”</w:t>
+        <w:t xml:space="preserve">It cited the statutory definition of a community corrections program, which, again, is a “program that is operated by or contracted for by a city, county, or group of counties ⁠. ⁠. ⁠. and that offers programs, services, or both, instead of incarceration in prison, and that are locally operated and provide a continuum of programming options from pretrial through post-adjudication.”</w:t>
       </w:r>
       <w:r>
         <w:t xml:space="preserve"> </w:t>
@@ -9761,7 +9761,7 @@
         <w:t xml:space="preserve"> </w:t>
       </w:r>
       <w:r>
-        <w:t xml:space="preserve">302; 297 NW2d 839 (1980) (“Contracts which violate a statute are contrary to public policy and cannot be enforced by the courts . . .”);</w:t>
+        <w:t xml:space="preserve">302; 297 NW2d 839 (1980) (“Contracts which violate a statute are contrary to public policy and cannot be enforced by the courts ⁠. ⁠. ⁠.”);</w:t>
       </w:r>
       <w:r>
         <w:t xml:space="preserve"> </w:t>

</xml_diff>